<commit_message>
Release Ranch Expense Tracker v1.4.0
</commit_message>
<xml_diff>
--- a/Ranch_Expense_Tracker_Web_App_Installation_Guide.docx
+++ b/Ranch_Expense_Tracker_Web_App_Installation_Guide.docx
@@ -2,6 +2,15 @@
 <file path=word/document.xml><?xml version="1.0" encoding="utf-8"?>
 <w:document xmlns:wpc="http://schemas.microsoft.com/office/word/2010/wordprocessingCanvas" xmlns:mo="http://schemas.microsoft.com/office/mac/office/2008/main" xmlns:mc="http://schemas.openxmlformats.org/markup-compatibility/2006" xmlns:mv="urn:schemas-microsoft-com:mac:vml" xmlns:o="urn:schemas-microsoft-com:office:office" xmlns:r="http://schemas.openxmlformats.org/officeDocument/2006/relationships" xmlns:m="http://schemas.openxmlformats.org/officeDocument/2006/math" xmlns:v="urn:schemas-microsoft-com:vml" xmlns:wp14="http://schemas.microsoft.com/office/word/2010/wordprocessingDrawing" xmlns:wp="http://schemas.openxmlformats.org/drawingml/2006/wordprocessingDrawing" xmlns:w10="urn:schemas-microsoft-com:office:word" xmlns:w="http://schemas.openxmlformats.org/wordprocessingml/2006/main" xmlns:w14="http://schemas.microsoft.com/office/word/2010/wordml" xmlns:wpg="http://schemas.microsoft.com/office/word/2010/wordprocessingGroup" xmlns:wpi="http://schemas.microsoft.com/office/word/2010/wordprocessingInk" xmlns:wne="http://schemas.microsoft.com/office/word/2006/wordml" xmlns:wps="http://schemas.microsoft.com/office/word/2010/wordprocessingShape" mc:Ignorable="w14 wp14">
   <w:body>
+    <w:p>
+      <w:pPr>
+        <w:pStyle w:val="Title"/>
+        <w:jc w:val="center"/>
+      </w:pPr>
+      <w:r>
+        <w:t>Ranch Expense Tracker</w:t>
+      </w:r>
+    </w:p>
     <w:p>
       <w:pPr>
         <w:jc w:val="center"/>
@@ -9,18 +18,8 @@
       <w:r>
         <w:rPr>
           <w:b/>
-          <w:color w:val="D39A30"/>
-          <w:sz w:val="24"/>
+          <w:sz w:val="30"/>
         </w:rPr>
-        <w:t>RANCH EXPENSE TRACKER</w:t>
-      </w:r>
-    </w:p>
-    <w:p>
-      <w:pPr>
-        <w:pStyle w:val="Title"/>
-        <w:jc w:val="center"/>
-      </w:pPr>
-      <w:r>
         <w:t>Web App Installation Guide</w:t>
       </w:r>
     </w:p>
@@ -30,530 +29,37 @@
       </w:pPr>
       <w:r>
         <w:rPr>
-          <w:b/>
-          <w:color w:val="557044"/>
-          <w:sz w:val="22"/>
+          <w:color w:val="7A171B"/>
+          <w:sz w:val="20"/>
         </w:rPr>
-        <w:t>Version 1.3.4 - Cross-Device Trial Readiness</w:t>
-      </w:r>
-    </w:p>
-    <w:p>
-      <w:pPr>
-        <w:jc w:val="center"/>
-      </w:pPr>
-      <w:r>
-        <w:rPr>
-          <w:i/>
-        </w:rPr>
-        <w:t>Use this guide to install the hosted application on company computers, phones, and tablets.</w:t>
+        <w:t>https://redpanda-17.github.io/ranch-expense-tracker/</w:t>
       </w:r>
     </w:p>
     <w:tbl>
       <w:tblPr>
         <w:tblW w:type="auto" w:w="0"/>
-        <w:jc w:val="center"/>
+        <w:tblLayout w:type="autofit"/>
         <w:tblLook w:firstColumn="1" w:firstRow="1" w:lastColumn="0" w:lastRow="0" w:noHBand="0" w:noVBand="1" w:val="04A0"/>
       </w:tblPr>
       <w:tblGrid>
-        <w:gridCol w:w="10224"/>
+        <w:gridCol w:w="10166"/>
       </w:tblGrid>
       <w:tr>
         <w:tc>
           <w:tcPr>
-            <w:tcW w:type="dxa" w:w="10224"/>
-            <w:shd w:fill="FFF4DC"/>
-            <w:tcMar>
-              <w:top w:w="120" w:type="dxa"/>
-              <w:start w:w="160" w:type="dxa"/>
-              <w:bottom w:w="120" w:type="dxa"/>
-              <w:end w:w="160" w:type="dxa"/>
-            </w:tcMar>
-            <w:tcBorders>
-              <w:top w:val="single" w:sz="10" w:color="D39A30"/>
-              <w:left w:val="single" w:sz="10" w:color="D39A30"/>
-              <w:bottom w:val="single" w:sz="10" w:color="D39A30"/>
-              <w:right w:val="single" w:sz="10" w:color="D39A30"/>
-            </w:tcBorders>
+            <w:tcW w:type="dxa" w:w="10166"/>
+            <w:shd w:fill="F7EFE2"/>
           </w:tcPr>
           <w:p>
+            <w:pPr>
+              <w:spacing w:after="0"/>
+            </w:pPr>
             <w:r>
               <w:rPr>
                 <w:b/>
-                <w:color w:val="7A171B"/>
+                <w:sz w:val="20"/>
               </w:rPr>
-              <w:t xml:space="preserve">Use the hosted link. </w:t>
-            </w:r>
-            <w:r>
-              <w:t>The standalone HTML file is a review copy and cannot provide the full installable/offline web-app experience. Open the HTTPS link provided by Accounting or IT.</w:t>
-            </w:r>
-          </w:p>
-        </w:tc>
-      </w:tr>
-    </w:tbl>
-    <w:p>
-      <w:pPr>
-        <w:spacing w:after="0"/>
-      </w:pPr>
-    </w:p>
-    <w:p>
-      <w:pPr>
-        <w:pStyle w:val="Heading1"/>
-      </w:pPr>
-      <w:r>
-        <w:t>Before anyone installs it</w:t>
-      </w:r>
-    </w:p>
-    <w:p>
-      <w:pPr>
-        <w:pStyle w:val="ListBullet"/>
-      </w:pPr>
-      <w:r>
-        <w:t>Install the app before entering real expenses whenever possible.</w:t>
-      </w:r>
-    </w:p>
-    <w:p>
-      <w:pPr>
-        <w:pStyle w:val="ListBullet"/>
-      </w:pPr>
-      <w:r>
-        <w:t>Do not use Incognito, InPrivate, or Private Browsing.</w:t>
-      </w:r>
-    </w:p>
-    <w:p>
-      <w:pPr>
-        <w:pStyle w:val="ListBullet"/>
-      </w:pPr>
-      <w:r>
-        <w:t>Data stays on the device, browser, and browser profile. Installation does not create an account or sync records.</w:t>
-      </w:r>
-    </w:p>
-    <w:p>
-      <w:pPr>
-        <w:pStyle w:val="ListBullet"/>
-      </w:pPr>
-      <w:r>
-        <w:t>Download a backup before uninstalling, clearing browser data, changing browsers, changing devices, or changing the hosted address.</w:t>
-      </w:r>
-    </w:p>
-    <w:p>
-      <w:pPr>
-        <w:pStyle w:val="ListBullet"/>
-      </w:pPr>
-      <w:r>
-        <w:t>After installation, open Settings &gt; About and confirm Version 1.3.4.</w:t>
-      </w:r>
-    </w:p>
-    <w:p>
-      <w:pPr>
-        <w:pStyle w:val="Heading1"/>
-      </w:pPr>
-      <w:r>
-        <w:t>Recommended installation method</w:t>
-      </w:r>
-    </w:p>
-    <w:tbl>
-      <w:tblPr>
-        <w:tblStyle w:val="TableGrid"/>
-        <w:tblW w:type="auto" w:w="0"/>
-        <w:jc w:val="center"/>
-        <w:tblLook w:firstColumn="1" w:firstRow="1" w:lastColumn="0" w:lastRow="0" w:noHBand="0" w:noVBand="1" w:val="04A0"/>
-      </w:tblPr>
-      <w:tblGrid>
-        <w:gridCol w:w="3408"/>
-        <w:gridCol w:w="3408"/>
-        <w:gridCol w:w="3408"/>
-      </w:tblGrid>
-      <w:tr>
-        <w:trPr>
-          <w:tblHeader w:val="true"/>
-        </w:trPr>
-        <w:tc>
-          <w:tcPr>
-            <w:tcW w:type="dxa" w:w="3408"/>
-            <w:shd w:fill="721419"/>
-            <w:tcMar>
-              <w:top w:w="80" w:type="dxa"/>
-              <w:start w:w="110" w:type="dxa"/>
-              <w:bottom w:w="80" w:type="dxa"/>
-              <w:end w:w="110" w:type="dxa"/>
-            </w:tcMar>
-          </w:tcPr>
-          <w:p>
-            <w:r>
-              <w:rPr>
-                <w:b/>
-                <w:color w:val="FFFDF8"/>
-              </w:rPr>
-              <w:t>Device</w:t>
-            </w:r>
-          </w:p>
-        </w:tc>
-        <w:tc>
-          <w:tcPr>
-            <w:tcW w:type="dxa" w:w="3408"/>
-            <w:shd w:fill="721419"/>
-            <w:tcMar>
-              <w:top w:w="80" w:type="dxa"/>
-              <w:start w:w="110" w:type="dxa"/>
-              <w:bottom w:w="80" w:type="dxa"/>
-              <w:end w:w="110" w:type="dxa"/>
-            </w:tcMar>
-          </w:tcPr>
-          <w:p>
-            <w:r>
-              <w:rPr>
-                <w:b/>
-                <w:color w:val="FFFDF8"/>
-              </w:rPr>
-              <w:t>Recommended browser</w:t>
-            </w:r>
-          </w:p>
-        </w:tc>
-        <w:tc>
-          <w:tcPr>
-            <w:tcW w:type="dxa" w:w="3408"/>
-            <w:shd w:fill="721419"/>
-            <w:tcMar>
-              <w:top w:w="80" w:type="dxa"/>
-              <w:start w:w="110" w:type="dxa"/>
-              <w:bottom w:w="80" w:type="dxa"/>
-              <w:end w:w="110" w:type="dxa"/>
-            </w:tcMar>
-          </w:tcPr>
-          <w:p>
-            <w:r>
-              <w:rPr>
-                <w:b/>
-                <w:color w:val="FFFDF8"/>
-              </w:rPr>
-              <w:t>Notes</w:t>
-            </w:r>
-          </w:p>
-        </w:tc>
-      </w:tr>
-      <w:tr>
-        <w:tc>
-          <w:tcPr>
-            <w:tcW w:type="dxa" w:w="3408"/>
-            <w:tcMar>
-              <w:top w:w="80" w:type="dxa"/>
-              <w:start w:w="110" w:type="dxa"/>
-              <w:bottom w:w="80" w:type="dxa"/>
-              <w:end w:w="110" w:type="dxa"/>
-            </w:tcMar>
-            <w:vAlign w:val="center"/>
-          </w:tcPr>
-          <w:p>
-            <w:r>
-              <w:t>Windows 10 or 11</w:t>
-            </w:r>
-          </w:p>
-        </w:tc>
-        <w:tc>
-          <w:tcPr>
-            <w:tcW w:type="dxa" w:w="3408"/>
-            <w:tcMar>
-              <w:top w:w="80" w:type="dxa"/>
-              <w:start w:w="110" w:type="dxa"/>
-              <w:bottom w:w="80" w:type="dxa"/>
-              <w:end w:w="110" w:type="dxa"/>
-            </w:tcMar>
-            <w:vAlign w:val="center"/>
-          </w:tcPr>
-          <w:p>
-            <w:r>
-              <w:t>Microsoft Edge</w:t>
-            </w:r>
-          </w:p>
-        </w:tc>
-        <w:tc>
-          <w:tcPr>
-            <w:tcW w:type="dxa" w:w="3408"/>
-            <w:tcMar>
-              <w:top w:w="80" w:type="dxa"/>
-              <w:start w:w="110" w:type="dxa"/>
-              <w:bottom w:w="80" w:type="dxa"/>
-              <w:end w:w="110" w:type="dxa"/>
-            </w:tcMar>
-            <w:vAlign w:val="center"/>
-          </w:tcPr>
-          <w:p>
-            <w:r>
-              <w:t>Best fit for company-managed Windows devices</w:t>
-            </w:r>
-          </w:p>
-        </w:tc>
-      </w:tr>
-      <w:tr>
-        <w:tc>
-          <w:tcPr>
-            <w:tcW w:type="dxa" w:w="3408"/>
-            <w:tcMar>
-              <w:top w:w="80" w:type="dxa"/>
-              <w:start w:w="110" w:type="dxa"/>
-              <w:bottom w:w="80" w:type="dxa"/>
-              <w:end w:w="110" w:type="dxa"/>
-            </w:tcMar>
-            <w:vAlign w:val="center"/>
-            <w:shd w:fill="F9F3E9"/>
-          </w:tcPr>
-          <w:p>
-            <w:r>
-              <w:t>Windows, macOS, or Linux</w:t>
-            </w:r>
-          </w:p>
-        </w:tc>
-        <w:tc>
-          <w:tcPr>
-            <w:tcW w:type="dxa" w:w="3408"/>
-            <w:tcMar>
-              <w:top w:w="80" w:type="dxa"/>
-              <w:start w:w="110" w:type="dxa"/>
-              <w:bottom w:w="80" w:type="dxa"/>
-              <w:end w:w="110" w:type="dxa"/>
-            </w:tcMar>
-            <w:vAlign w:val="center"/>
-            <w:shd w:fill="F9F3E9"/>
-          </w:tcPr>
-          <w:p>
-            <w:r>
-              <w:t>Google Chrome</w:t>
-            </w:r>
-          </w:p>
-        </w:tc>
-        <w:tc>
-          <w:tcPr>
-            <w:tcW w:type="dxa" w:w="3408"/>
-            <w:tcMar>
-              <w:top w:w="80" w:type="dxa"/>
-              <w:start w:w="110" w:type="dxa"/>
-              <w:bottom w:w="80" w:type="dxa"/>
-              <w:end w:w="110" w:type="dxa"/>
-            </w:tcMar>
-            <w:vAlign w:val="center"/>
-            <w:shd w:fill="F9F3E9"/>
-          </w:tcPr>
-          <w:p>
-            <w:r>
-              <w:t>Consistent desktop PWA installation</w:t>
-            </w:r>
-          </w:p>
-        </w:tc>
-      </w:tr>
-      <w:tr>
-        <w:tc>
-          <w:tcPr>
-            <w:tcW w:type="dxa" w:w="3408"/>
-            <w:tcMar>
-              <w:top w:w="80" w:type="dxa"/>
-              <w:start w:w="110" w:type="dxa"/>
-              <w:bottom w:w="80" w:type="dxa"/>
-              <w:end w:w="110" w:type="dxa"/>
-            </w:tcMar>
-            <w:vAlign w:val="center"/>
-          </w:tcPr>
-          <w:p>
-            <w:r>
-              <w:t>Chromebook</w:t>
-            </w:r>
-          </w:p>
-        </w:tc>
-        <w:tc>
-          <w:tcPr>
-            <w:tcW w:type="dxa" w:w="3408"/>
-            <w:tcMar>
-              <w:top w:w="80" w:type="dxa"/>
-              <w:start w:w="110" w:type="dxa"/>
-              <w:bottom w:w="80" w:type="dxa"/>
-              <w:end w:w="110" w:type="dxa"/>
-            </w:tcMar>
-            <w:vAlign w:val="center"/>
-          </w:tcPr>
-          <w:p>
-            <w:r>
-              <w:t>Google Chrome</w:t>
-            </w:r>
-          </w:p>
-        </w:tc>
-        <w:tc>
-          <w:tcPr>
-            <w:tcW w:type="dxa" w:w="3408"/>
-            <w:tcMar>
-              <w:top w:w="80" w:type="dxa"/>
-              <w:start w:w="110" w:type="dxa"/>
-              <w:bottom w:w="80" w:type="dxa"/>
-              <w:end w:w="110" w:type="dxa"/>
-            </w:tcMar>
-            <w:vAlign w:val="center"/>
-          </w:tcPr>
-          <w:p>
-            <w:r>
-              <w:t>Installs into the Chromebook Launcher</w:t>
-            </w:r>
-          </w:p>
-        </w:tc>
-      </w:tr>
-      <w:tr>
-        <w:tc>
-          <w:tcPr>
-            <w:tcW w:type="dxa" w:w="3408"/>
-            <w:tcMar>
-              <w:top w:w="80" w:type="dxa"/>
-              <w:start w:w="110" w:type="dxa"/>
-              <w:bottom w:w="80" w:type="dxa"/>
-              <w:end w:w="110" w:type="dxa"/>
-            </w:tcMar>
-            <w:vAlign w:val="center"/>
-            <w:shd w:fill="F9F3E9"/>
-          </w:tcPr>
-          <w:p>
-            <w:r>
-              <w:t>Android phone or tablet</w:t>
-            </w:r>
-          </w:p>
-        </w:tc>
-        <w:tc>
-          <w:tcPr>
-            <w:tcW w:type="dxa" w:w="3408"/>
-            <w:tcMar>
-              <w:top w:w="80" w:type="dxa"/>
-              <w:start w:w="110" w:type="dxa"/>
-              <w:bottom w:w="80" w:type="dxa"/>
-              <w:end w:w="110" w:type="dxa"/>
-            </w:tcMar>
-            <w:vAlign w:val="center"/>
-            <w:shd w:fill="F9F3E9"/>
-          </w:tcPr>
-          <w:p>
-            <w:r>
-              <w:t>Google Chrome</w:t>
-            </w:r>
-          </w:p>
-        </w:tc>
-        <w:tc>
-          <w:tcPr>
-            <w:tcW w:type="dxa" w:w="3408"/>
-            <w:tcMar>
-              <w:top w:w="80" w:type="dxa"/>
-              <w:start w:w="110" w:type="dxa"/>
-              <w:bottom w:w="80" w:type="dxa"/>
-              <w:end w:w="110" w:type="dxa"/>
-            </w:tcMar>
-            <w:vAlign w:val="center"/>
-            <w:shd w:fill="F9F3E9"/>
-          </w:tcPr>
-          <w:p>
-            <w:r>
-              <w:t>Installs to Home screen/app list</w:t>
-            </w:r>
-          </w:p>
-        </w:tc>
-      </w:tr>
-      <w:tr>
-        <w:tc>
-          <w:tcPr>
-            <w:tcW w:type="dxa" w:w="3408"/>
-            <w:tcMar>
-              <w:top w:w="80" w:type="dxa"/>
-              <w:start w:w="110" w:type="dxa"/>
-              <w:bottom w:w="80" w:type="dxa"/>
-              <w:end w:w="110" w:type="dxa"/>
-            </w:tcMar>
-            <w:vAlign w:val="center"/>
-          </w:tcPr>
-          <w:p>
-            <w:r>
-              <w:t>iPhone or iPad</w:t>
-            </w:r>
-          </w:p>
-        </w:tc>
-        <w:tc>
-          <w:tcPr>
-            <w:tcW w:type="dxa" w:w="3408"/>
-            <w:tcMar>
-              <w:top w:w="80" w:type="dxa"/>
-              <w:start w:w="110" w:type="dxa"/>
-              <w:bottom w:w="80" w:type="dxa"/>
-              <w:end w:w="110" w:type="dxa"/>
-            </w:tcMar>
-            <w:vAlign w:val="center"/>
-          </w:tcPr>
-          <w:p>
-            <w:r>
-              <w:t>Safari</w:t>
-            </w:r>
-          </w:p>
-        </w:tc>
-        <w:tc>
-          <w:tcPr>
-            <w:tcW w:type="dxa" w:w="3408"/>
-            <w:tcMar>
-              <w:top w:w="80" w:type="dxa"/>
-              <w:start w:w="110" w:type="dxa"/>
-              <w:bottom w:w="80" w:type="dxa"/>
-              <w:end w:w="110" w:type="dxa"/>
-            </w:tcMar>
-            <w:vAlign w:val="center"/>
-          </w:tcPr>
-          <w:p>
-            <w:r>
-              <w:t>Recommended Apple mobile installation path</w:t>
-            </w:r>
-          </w:p>
-        </w:tc>
-      </w:tr>
-      <w:tr>
-        <w:tc>
-          <w:tcPr>
-            <w:tcW w:type="dxa" w:w="3408"/>
-            <w:tcMar>
-              <w:top w:w="80" w:type="dxa"/>
-              <w:start w:w="110" w:type="dxa"/>
-              <w:bottom w:w="80" w:type="dxa"/>
-              <w:end w:w="110" w:type="dxa"/>
-            </w:tcMar>
-            <w:vAlign w:val="center"/>
-            <w:shd w:fill="F9F3E9"/>
-          </w:tcPr>
-          <w:p>
-            <w:r>
-              <w:t>Mac, macOS Sonoma 14+</w:t>
-            </w:r>
-          </w:p>
-        </w:tc>
-        <w:tc>
-          <w:tcPr>
-            <w:tcW w:type="dxa" w:w="3408"/>
-            <w:tcMar>
-              <w:top w:w="80" w:type="dxa"/>
-              <w:start w:w="110" w:type="dxa"/>
-              <w:bottom w:w="80" w:type="dxa"/>
-              <w:end w:w="110" w:type="dxa"/>
-            </w:tcMar>
-            <w:vAlign w:val="center"/>
-            <w:shd w:fill="F9F3E9"/>
-          </w:tcPr>
-          <w:p>
-            <w:r>
-              <w:t>Safari or Chrome</w:t>
-            </w:r>
-          </w:p>
-        </w:tc>
-        <w:tc>
-          <w:tcPr>
-            <w:tcW w:type="dxa" w:w="3408"/>
-            <w:tcMar>
-              <w:top w:w="80" w:type="dxa"/>
-              <w:start w:w="110" w:type="dxa"/>
-              <w:bottom w:w="80" w:type="dxa"/>
-              <w:end w:w="110" w:type="dxa"/>
-            </w:tcMar>
-            <w:vAlign w:val="center"/>
-            <w:shd w:fill="F9F3E9"/>
-          </w:tcPr>
-          <w:p>
-            <w:r>
-              <w:t>Safari supports Add to Dock; install before entering data</w:t>
+              <w:t>Use the same device, browser, and browser profile each time. Expense data is stored locally in that browser. Do not use Private or Incognito mode.</w:t>
             </w:r>
           </w:p>
         </w:tc>
@@ -564,119 +70,82 @@
         <w:pStyle w:val="Heading1"/>
       </w:pPr>
       <w:r>
-        <w:t>Windows 10 or 11 - Microsoft Edge</w:t>
+        <w:t>Windows - Microsoft Edge</w:t>
       </w:r>
     </w:p>
     <w:p>
       <w:pPr>
-        <w:spacing w:after="60"/>
-        <w:ind w:left="403" w:hanging="403"/>
+        <w:spacing w:after="40"/>
+        <w:ind w:left="259" w:hanging="259"/>
       </w:pPr>
       <w:r>
         <w:rPr>
           <w:b/>
-          <w:color w:val="7A171B"/>
         </w:rPr>
-        <w:t>1.</w:t>
+        <w:t xml:space="preserve">1. </w:t>
       </w:r>
       <w:r>
-        <w:t xml:space="preserve">  Open Microsoft Edge.</w:t>
+        <w:t>Open Microsoft Edge and go to the Ranch Expense Tracker website.</w:t>
       </w:r>
     </w:p>
     <w:p>
       <w:pPr>
-        <w:spacing w:after="60"/>
-        <w:ind w:left="403" w:hanging="403"/>
+        <w:spacing w:after="40"/>
+        <w:ind w:left="259" w:hanging="259"/>
       </w:pPr>
       <w:r>
         <w:rPr>
           <w:b/>
-          <w:color w:val="7A171B"/>
         </w:rPr>
-        <w:t>2.</w:t>
+        <w:t xml:space="preserve">2. </w:t>
       </w:r>
       <w:r>
-        <w:t xml:space="preserve">  Open the Ranch Expense Tracker hosted link.</w:t>
+        <w:t>Select the three-dot menu in the upper-right corner.</w:t>
       </w:r>
     </w:p>
     <w:p>
       <w:pPr>
-        <w:spacing w:after="60"/>
-        <w:ind w:left="403" w:hanging="403"/>
+        <w:spacing w:after="40"/>
+        <w:ind w:left="259" w:hanging="259"/>
       </w:pPr>
       <w:r>
         <w:rPr>
           <w:b/>
-          <w:color w:val="7A171B"/>
         </w:rPr>
-        <w:t>3.</w:t>
+        <w:t xml:space="preserve">3. </w:t>
       </w:r>
       <w:r>
-        <w:t xml:space="preserve">  Select Settings and more (...) in the upper-right corner.</w:t>
+        <w:t>Select Apps or More tools, then select Install this site as an app.</w:t>
       </w:r>
     </w:p>
     <w:p>
       <w:pPr>
-        <w:spacing w:after="60"/>
-        <w:ind w:left="403" w:hanging="403"/>
+        <w:spacing w:after="40"/>
+        <w:ind w:left="259" w:hanging="259"/>
       </w:pPr>
       <w:r>
         <w:rPr>
           <w:b/>
-          <w:color w:val="7A171B"/>
         </w:rPr>
-        <w:t>4.</w:t>
+        <w:t xml:space="preserve">4. </w:t>
       </w:r>
       <w:r>
-        <w:t xml:space="preserve">  Select More tools &gt; Apps &gt; Install this site as an app. Edge may instead show an install prompt in the address bar.</w:t>
+        <w:t>Select Install.</w:t>
       </w:r>
     </w:p>
     <w:p>
       <w:pPr>
-        <w:spacing w:after="60"/>
-        <w:ind w:left="403" w:hanging="403"/>
+        <w:spacing w:after="40"/>
+        <w:ind w:left="259" w:hanging="259"/>
       </w:pPr>
       <w:r>
         <w:rPr>
           <w:b/>
-          <w:color w:val="7A171B"/>
         </w:rPr>
-        <w:t>5.</w:t>
+        <w:t xml:space="preserve">5. </w:t>
       </w:r>
       <w:r>
-        <w:t xml:space="preserve">  Confirm the name Ranch Expense Tracker, then select Install.</w:t>
-      </w:r>
-    </w:p>
-    <w:p>
-      <w:pPr>
-        <w:spacing w:after="60"/>
-        <w:ind w:left="403" w:hanging="403"/>
-      </w:pPr>
-      <w:r>
-        <w:rPr>
-          <w:b/>
-          <w:color w:val="7A171B"/>
-        </w:rPr>
-        <w:t>6.</w:t>
-      </w:r>
-      <w:r>
-        <w:t xml:space="preserve">  When offered, pin it to the taskbar or Start menu.</w:t>
-      </w:r>
-    </w:p>
-    <w:p>
-      <w:pPr>
-        <w:spacing w:after="60"/>
-        <w:ind w:left="403" w:hanging="403"/>
-      </w:pPr>
-      <w:r>
-        <w:rPr>
-          <w:b/>
-          <w:color w:val="7A171B"/>
-        </w:rPr>
-        <w:t>7.</w:t>
-      </w:r>
-      <w:r>
-        <w:t xml:space="preserve">  Open the installed app and confirm Version 1.3.4.</w:t>
+        <w:t>Pin the app to Start, the taskbar, or the desktop if those options appear.</w:t>
       </w:r>
     </w:p>
     <w:p>
@@ -684,87 +153,82 @@
         <w:pStyle w:val="Heading1"/>
       </w:pPr>
       <w:r>
-        <w:t>Windows, macOS, or Linux - Google Chrome</w:t>
+        <w:t>Windows, Mac, Linux, or Chromebook - Google Chrome</w:t>
       </w:r>
     </w:p>
     <w:p>
       <w:pPr>
-        <w:spacing w:after="60"/>
-        <w:ind w:left="403" w:hanging="403"/>
+        <w:spacing w:after="40"/>
+        <w:ind w:left="259" w:hanging="259"/>
       </w:pPr>
       <w:r>
         <w:rPr>
           <w:b/>
-          <w:color w:val="7A171B"/>
         </w:rPr>
-        <w:t>1.</w:t>
+        <w:t xml:space="preserve">1. </w:t>
       </w:r>
       <w:r>
-        <w:t xml:space="preserve">  Open Google Chrome.</w:t>
+        <w:t>Open Google Chrome and go to the Ranch Expense Tracker website.</w:t>
       </w:r>
     </w:p>
     <w:p>
       <w:pPr>
-        <w:spacing w:after="60"/>
-        <w:ind w:left="403" w:hanging="403"/>
+        <w:spacing w:after="40"/>
+        <w:ind w:left="259" w:hanging="259"/>
       </w:pPr>
       <w:r>
         <w:rPr>
           <w:b/>
-          <w:color w:val="7A171B"/>
         </w:rPr>
-        <w:t>2.</w:t>
+        <w:t xml:space="preserve">2. </w:t>
       </w:r>
       <w:r>
-        <w:t xml:space="preserve">  Open the Ranch Expense Tracker hosted link.</w:t>
+        <w:t>Select the three-dot menu.</w:t>
       </w:r>
     </w:p>
     <w:p>
       <w:pPr>
-        <w:spacing w:after="60"/>
-        <w:ind w:left="403" w:hanging="403"/>
+        <w:spacing w:after="40"/>
+        <w:ind w:left="259" w:hanging="259"/>
       </w:pPr>
       <w:r>
         <w:rPr>
           <w:b/>
-          <w:color w:val="7A171B"/>
         </w:rPr>
-        <w:t>3.</w:t>
+        <w:t xml:space="preserve">3. </w:t>
       </w:r>
       <w:r>
-        <w:t xml:space="preserve">  Select More (...) &gt; Cast, save, and share &gt; Install page as app. Chrome may instead show an Install icon in the address bar.</w:t>
+        <w:t>Select Cast, save, and share, then Install page as app.</w:t>
       </w:r>
     </w:p>
     <w:p>
       <w:pPr>
-        <w:spacing w:after="60"/>
-        <w:ind w:left="403" w:hanging="403"/>
+        <w:spacing w:after="40"/>
+        <w:ind w:left="259" w:hanging="259"/>
       </w:pPr>
       <w:r>
         <w:rPr>
           <w:b/>
-          <w:color w:val="7A171B"/>
         </w:rPr>
-        <w:t>4.</w:t>
+        <w:t xml:space="preserve">4. </w:t>
       </w:r>
       <w:r>
-        <w:t xml:space="preserve">  Follow the on-screen instructions.</w:t>
+        <w:t>If an Install icon appears in the address bar, you can select that instead.</w:t>
       </w:r>
     </w:p>
     <w:p>
       <w:pPr>
-        <w:spacing w:after="60"/>
-        <w:ind w:left="403" w:hanging="403"/>
+        <w:spacing w:after="40"/>
+        <w:ind w:left="259" w:hanging="259"/>
       </w:pPr>
       <w:r>
         <w:rPr>
           <w:b/>
-          <w:color w:val="7A171B"/>
         </w:rPr>
-        <w:t>5.</w:t>
+        <w:t xml:space="preserve">5. </w:t>
       </w:r>
       <w:r>
-        <w:t xml:space="preserve">  Open the installed app and confirm Version 1.3.4.</w:t>
+        <w:t>Follow the prompts to finish installation.</w:t>
       </w:r>
     </w:p>
     <w:p>
@@ -772,207 +236,39 @@
         <w:pStyle w:val="Heading1"/>
       </w:pPr>
       <w:r>
-        <w:t>Chromebook - Google Chrome</w:t>
+        <w:t>Confirm the installation</w:t>
       </w:r>
     </w:p>
     <w:p>
       <w:pPr>
-        <w:spacing w:after="60"/>
-        <w:ind w:left="403" w:hanging="403"/>
+        <w:pStyle w:val="ListBullet"/>
+        <w:spacing w:after="40"/>
       </w:pPr>
       <w:r>
-        <w:rPr>
-          <w:b/>
-          <w:color w:val="7A171B"/>
-        </w:rPr>
-        <w:t>1.</w:t>
-      </w:r>
-      <w:r>
-        <w:t xml:space="preserve">  Open Chrome and go to the hosted link.</w:t>
+        <w:t>Open the Ranch Expense Tracker icon.</w:t>
       </w:r>
     </w:p>
     <w:p>
       <w:pPr>
-        <w:spacing w:after="60"/>
-        <w:ind w:left="403" w:hanging="403"/>
+        <w:pStyle w:val="ListBullet"/>
+        <w:spacing w:after="40"/>
       </w:pPr>
       <w:r>
-        <w:rPr>
-          <w:b/>
-          <w:color w:val="7A171B"/>
-        </w:rPr>
-        <w:t>2.</w:t>
-      </w:r>
-      <w:r>
-        <w:t xml:space="preserve">  Select More (...) &gt; Cast, save, and share &gt; Install page as app, or select the Install icon in the address bar.</w:t>
+        <w:t>Confirm the footer shows Version 1.4.0.</w:t>
       </w:r>
     </w:p>
     <w:p>
       <w:pPr>
-        <w:spacing w:after="60"/>
-        <w:ind w:left="403" w:hanging="403"/>
+        <w:pStyle w:val="ListBullet"/>
+        <w:spacing w:after="40"/>
       </w:pPr>
       <w:r>
-        <w:rPr>
-          <w:b/>
-          <w:color w:val="7A171B"/>
-        </w:rPr>
-        <w:t>3.</w:t>
-      </w:r>
-      <w:r>
-        <w:t xml:space="preserve">  Confirm the installation.</w:t>
+        <w:t>Open Settings and enter your name, department, and report recipient.</w:t>
       </w:r>
     </w:p>
     <w:p>
-      <w:pPr>
-        <w:spacing w:after="60"/>
-        <w:ind w:left="403" w:hanging="403"/>
-      </w:pPr>
       <w:r>
-        <w:rPr>
-          <w:b/>
-          <w:color w:val="7A171B"/>
-        </w:rPr>
-        <w:t>4.</w:t>
-      </w:r>
-      <w:r>
-        <w:t xml:space="preserve">  Open Ranch Expense Tracker from the Chromebook Launcher.</w:t>
-      </w:r>
-    </w:p>
-    <w:p>
-      <w:pPr>
-        <w:spacing w:after="60"/>
-        <w:ind w:left="403" w:hanging="403"/>
-      </w:pPr>
-      <w:r>
-        <w:rPr>
-          <w:b/>
-          <w:color w:val="7A171B"/>
-        </w:rPr>
-        <w:t>5.</w:t>
-      </w:r>
-      <w:r>
-        <w:t xml:space="preserve">  Confirm Version 1.3.4.</w:t>
-      </w:r>
-    </w:p>
-    <w:p>
-      <w:pPr>
-        <w:pStyle w:val="Heading1"/>
-      </w:pPr>
-      <w:r>
-        <w:t>Android phone or tablet - Google Chrome</w:t>
-      </w:r>
-    </w:p>
-    <w:p>
-      <w:pPr>
-        <w:spacing w:after="60"/>
-        <w:ind w:left="403" w:hanging="403"/>
-      </w:pPr>
-      <w:r>
-        <w:rPr>
-          <w:b/>
-          <w:color w:val="7A171B"/>
-        </w:rPr>
-        <w:t>1.</w:t>
-      </w:r>
-      <w:r>
-        <w:t xml:space="preserve">  Open Chrome.</w:t>
-      </w:r>
-    </w:p>
-    <w:p>
-      <w:pPr>
-        <w:spacing w:after="60"/>
-        <w:ind w:left="403" w:hanging="403"/>
-      </w:pPr>
-      <w:r>
-        <w:rPr>
-          <w:b/>
-          <w:color w:val="7A171B"/>
-        </w:rPr>
-        <w:t>2.</w:t>
-      </w:r>
-      <w:r>
-        <w:t xml:space="preserve">  Open the Ranch Expense Tracker hosted link.</w:t>
-      </w:r>
-    </w:p>
-    <w:p>
-      <w:pPr>
-        <w:spacing w:after="60"/>
-        <w:ind w:left="403" w:hanging="403"/>
-      </w:pPr>
-      <w:r>
-        <w:rPr>
-          <w:b/>
-          <w:color w:val="7A171B"/>
-        </w:rPr>
-        <w:t>3.</w:t>
-      </w:r>
-      <w:r>
-        <w:t xml:space="preserve">  Tap More (...) to the right of the address bar.</w:t>
-      </w:r>
-    </w:p>
-    <w:p>
-      <w:pPr>
-        <w:spacing w:after="60"/>
-        <w:ind w:left="403" w:hanging="403"/>
-      </w:pPr>
-      <w:r>
-        <w:rPr>
-          <w:b/>
-          <w:color w:val="7A171B"/>
-        </w:rPr>
-        <w:t>4.</w:t>
-      </w:r>
-      <w:r>
-        <w:t xml:space="preserve">  Tap Install and create shortcut &gt; Install.</w:t>
-      </w:r>
-    </w:p>
-    <w:p>
-      <w:pPr>
-        <w:spacing w:after="60"/>
-        <w:ind w:left="403" w:hanging="403"/>
-      </w:pPr>
-      <w:r>
-        <w:rPr>
-          <w:b/>
-          <w:color w:val="7A171B"/>
-        </w:rPr>
-        <w:t>5.</w:t>
-      </w:r>
-      <w:r>
-        <w:t xml:space="preserve">  Follow the on-screen instructions.</w:t>
-      </w:r>
-    </w:p>
-    <w:p>
-      <w:pPr>
-        <w:spacing w:after="60"/>
-        <w:ind w:left="403" w:hanging="403"/>
-      </w:pPr>
-      <w:r>
-        <w:rPr>
-          <w:b/>
-          <w:color w:val="7A171B"/>
-        </w:rPr>
-        <w:t>6.</w:t>
-      </w:r>
-      <w:r>
-        <w:t xml:space="preserve">  Open Ranch Expense Tracker from the Home screen or app list.</w:t>
-      </w:r>
-    </w:p>
-    <w:p>
-      <w:pPr>
-        <w:spacing w:after="60"/>
-        <w:ind w:left="403" w:hanging="403"/>
-      </w:pPr>
-      <w:r>
-        <w:rPr>
-          <w:b/>
-          <w:color w:val="7A171B"/>
-        </w:rPr>
-        <w:t>7.</w:t>
-      </w:r>
-      <w:r>
-        <w:t xml:space="preserve">  Confirm Version 1.3.4.</w:t>
+        <w:br w:type="page"/>
       </w:r>
     </w:p>
     <w:p>
@@ -985,162 +281,78 @@
     </w:p>
     <w:p>
       <w:pPr>
-        <w:spacing w:after="60"/>
-        <w:ind w:left="403" w:hanging="403"/>
+        <w:spacing w:after="40"/>
+        <w:ind w:left="259" w:hanging="259"/>
       </w:pPr>
       <w:r>
         <w:rPr>
           <w:b/>
-          <w:color w:val="7A171B"/>
         </w:rPr>
-        <w:t>1.</w:t>
+        <w:t xml:space="preserve">1. </w:t>
       </w:r>
       <w:r>
-        <w:t xml:space="preserve">  Open Safari.</w:t>
+        <w:t>Open Safari and go to the Ranch Expense Tracker website.</w:t>
       </w:r>
     </w:p>
     <w:p>
       <w:pPr>
-        <w:spacing w:after="60"/>
-        <w:ind w:left="403" w:hanging="403"/>
+        <w:spacing w:after="40"/>
+        <w:ind w:left="259" w:hanging="259"/>
       </w:pPr>
       <w:r>
         <w:rPr>
           <w:b/>
-          <w:color w:val="7A171B"/>
         </w:rPr>
-        <w:t>2.</w:t>
+        <w:t xml:space="preserve">2. </w:t>
       </w:r>
       <w:r>
-        <w:t xml:space="preserve">  Open the Ranch Expense Tracker hosted link.</w:t>
+        <w:t>Tap the Share button.</w:t>
       </w:r>
     </w:p>
     <w:p>
       <w:pPr>
-        <w:spacing w:after="60"/>
-        <w:ind w:left="403" w:hanging="403"/>
+        <w:spacing w:after="40"/>
+        <w:ind w:left="259" w:hanging="259"/>
       </w:pPr>
       <w:r>
         <w:rPr>
           <w:b/>
-          <w:color w:val="7A171B"/>
         </w:rPr>
-        <w:t>3.</w:t>
+        <w:t xml:space="preserve">3. </w:t>
       </w:r>
       <w:r>
-        <w:t xml:space="preserve">  Tap the More button, then Share. Depending on the Safari layout, the Share button may already be visible.</w:t>
+        <w:t>Scroll down and tap Add to Home Screen.</w:t>
       </w:r>
     </w:p>
     <w:p>
       <w:pPr>
-        <w:spacing w:after="60"/>
-        <w:ind w:left="403" w:hanging="403"/>
+        <w:spacing w:after="40"/>
+        <w:ind w:left="259" w:hanging="259"/>
       </w:pPr>
       <w:r>
         <w:rPr>
           <w:b/>
-          <w:color w:val="7A171B"/>
         </w:rPr>
-        <w:t>4.</w:t>
+        <w:t xml:space="preserve">4. </w:t>
       </w:r>
       <w:r>
-        <w:t xml:space="preserve">  Scroll down and tap Add to Home Screen.</w:t>
+        <w:t>Turn on Open as Web App if that option appears.</w:t>
       </w:r>
     </w:p>
     <w:p>
       <w:pPr>
-        <w:spacing w:after="60"/>
-        <w:ind w:left="403" w:hanging="403"/>
+        <w:spacing w:after="40"/>
+        <w:ind w:left="259" w:hanging="259"/>
       </w:pPr>
       <w:r>
         <w:rPr>
           <w:b/>
-          <w:color w:val="7A171B"/>
         </w:rPr>
-        <w:t>5.</w:t>
+        <w:t xml:space="preserve">5. </w:t>
       </w:r>
       <w:r>
-        <w:t xml:space="preserve">  Turn on Open as Web App.</w:t>
+        <w:t>Tap Add.</w:t>
       </w:r>
-    </w:p>
-    <w:p>
-      <w:pPr>
-        <w:spacing w:after="60"/>
-        <w:ind w:left="403" w:hanging="403"/>
-      </w:pPr>
-      <w:r>
-        <w:rPr>
-          <w:b/>
-          <w:color w:val="7A171B"/>
-        </w:rPr>
-        <w:t>6.</w:t>
-      </w:r>
-      <w:r>
-        <w:t xml:space="preserve">  Tap Add.</w:t>
-      </w:r>
-    </w:p>
-    <w:p>
-      <w:pPr>
-        <w:spacing w:after="60"/>
-        <w:ind w:left="403" w:hanging="403"/>
-      </w:pPr>
-      <w:r>
-        <w:rPr>
-          <w:b/>
-          <w:color w:val="7A171B"/>
-        </w:rPr>
-        <w:t>7.</w:t>
-      </w:r>
-      <w:r>
-        <w:t xml:space="preserve">  Open Ranch Expense Tracker from the Home Screen and confirm Version 1.3.4.</w:t>
-      </w:r>
-    </w:p>
-    <w:tbl>
-      <w:tblPr>
-        <w:tblW w:type="auto" w:w="0"/>
-        <w:jc w:val="center"/>
-        <w:tblLook w:firstColumn="1" w:firstRow="1" w:lastColumn="0" w:lastRow="0" w:noHBand="0" w:noVBand="1" w:val="04A0"/>
-      </w:tblPr>
-      <w:tblGrid>
-        <w:gridCol w:w="10224"/>
-      </w:tblGrid>
-      <w:tr>
-        <w:tc>
-          <w:tcPr>
-            <w:tcW w:type="dxa" w:w="10224"/>
-            <w:shd w:fill="F9F3E9"/>
-            <w:tcMar>
-              <w:top w:w="120" w:type="dxa"/>
-              <w:start w:w="160" w:type="dxa"/>
-              <w:bottom w:w="120" w:type="dxa"/>
-              <w:end w:w="160" w:type="dxa"/>
-            </w:tcMar>
-            <w:tcBorders>
-              <w:top w:val="single" w:sz="10" w:color="D39A30"/>
-              <w:left w:val="single" w:sz="10" w:color="D39A30"/>
-              <w:bottom w:val="single" w:sz="10" w:color="D39A30"/>
-              <w:right w:val="single" w:sz="10" w:color="D39A30"/>
-            </w:tcBorders>
-          </w:tcPr>
-          <w:p>
-            <w:r>
-              <w:rPr>
-                <w:b/>
-                <w:color w:val="7A171B"/>
-              </w:rPr>
-              <w:t xml:space="preserve">Add to Home Screen missing? </w:t>
-            </w:r>
-            <w:r>
-              <w:t>Scroll to the bottom of the Share actions, tap Edit Actions, then add Add to Home Screen.</w:t>
-            </w:r>
-          </w:p>
-        </w:tc>
-      </w:tr>
-    </w:tbl>
-    <w:p>
-      <w:pPr>
-        <w:spacing w:after="0"/>
-      </w:pPr>
     </w:p>
     <w:p>
       <w:pPr>
@@ -1152,98 +364,77 @@
     </w:p>
     <w:p>
       <w:pPr>
-        <w:spacing w:after="60"/>
-        <w:ind w:left="403" w:hanging="403"/>
+        <w:spacing w:after="40"/>
+        <w:ind w:left="259" w:hanging="259"/>
       </w:pPr>
       <w:r>
         <w:rPr>
           <w:b/>
-          <w:color w:val="7A171B"/>
         </w:rPr>
-        <w:t>1.</w:t>
+        <w:t xml:space="preserve">1. </w:t>
       </w:r>
       <w:r>
-        <w:t xml:space="preserve">  Open Safari.</w:t>
+        <w:t>Open Safari and go to the website.</w:t>
       </w:r>
     </w:p>
     <w:p>
       <w:pPr>
-        <w:spacing w:after="60"/>
-        <w:ind w:left="403" w:hanging="403"/>
+        <w:spacing w:after="40"/>
+        <w:ind w:left="259" w:hanging="259"/>
       </w:pPr>
       <w:r>
         <w:rPr>
           <w:b/>
-          <w:color w:val="7A171B"/>
         </w:rPr>
-        <w:t>2.</w:t>
+        <w:t xml:space="preserve">2. </w:t>
       </w:r>
       <w:r>
-        <w:t xml:space="preserve">  Open the Ranch Expense Tracker hosted link.</w:t>
+        <w:t>Tap Share.</w:t>
       </w:r>
     </w:p>
     <w:p>
       <w:pPr>
-        <w:spacing w:after="60"/>
-        <w:ind w:left="403" w:hanging="403"/>
+        <w:spacing w:after="40"/>
+        <w:ind w:left="259" w:hanging="259"/>
       </w:pPr>
       <w:r>
         <w:rPr>
           <w:b/>
-          <w:color w:val="7A171B"/>
         </w:rPr>
-        <w:t>3.</w:t>
+        <w:t xml:space="preserve">3. </w:t>
       </w:r>
       <w:r>
-        <w:t xml:space="preserve">  Tap Share, then More, then Add to Home Screen.</w:t>
+        <w:t>Tap Add to Home Screen.</w:t>
       </w:r>
     </w:p>
     <w:p>
       <w:pPr>
-        <w:spacing w:after="60"/>
-        <w:ind w:left="403" w:hanging="403"/>
+        <w:spacing w:after="40"/>
+        <w:ind w:left="259" w:hanging="259"/>
       </w:pPr>
       <w:r>
         <w:rPr>
           <w:b/>
-          <w:color w:val="7A171B"/>
         </w:rPr>
-        <w:t>4.</w:t>
+        <w:t xml:space="preserve">4. </w:t>
       </w:r>
       <w:r>
-        <w:t xml:space="preserve">  Turn on Open as Web App.</w:t>
+        <w:t>Turn on Open as Web App if shown.</w:t>
       </w:r>
     </w:p>
     <w:p>
       <w:pPr>
-        <w:spacing w:after="60"/>
-        <w:ind w:left="403" w:hanging="403"/>
+        <w:spacing w:after="40"/>
+        <w:ind w:left="259" w:hanging="259"/>
       </w:pPr>
       <w:r>
         <w:rPr>
           <w:b/>
-          <w:color w:val="7A171B"/>
         </w:rPr>
-        <w:t>5.</w:t>
+        <w:t xml:space="preserve">5. </w:t>
       </w:r>
       <w:r>
-        <w:t xml:space="preserve">  Tap Add.</w:t>
-      </w:r>
-    </w:p>
-    <w:p>
-      <w:pPr>
-        <w:spacing w:after="60"/>
-        <w:ind w:left="403" w:hanging="403"/>
-      </w:pPr>
-      <w:r>
-        <w:rPr>
-          <w:b/>
-          <w:color w:val="7A171B"/>
-        </w:rPr>
-        <w:t>6.</w:t>
-      </w:r>
-      <w:r>
-        <w:t xml:space="preserve">  Open Ranch Expense Tracker from the Home Screen and confirm Version 1.3.4.</w:t>
+        <w:t>Tap Add.</w:t>
       </w:r>
     </w:p>
     <w:p>
@@ -1251,219 +442,67 @@
         <w:pStyle w:val="Heading1"/>
       </w:pPr>
       <w:r>
-        <w:t>Mac - Safari (macOS Sonoma 14 or later)</w:t>
+        <w:t>Android phone or tablet - Chrome</w:t>
       </w:r>
     </w:p>
     <w:p>
       <w:pPr>
-        <w:spacing w:after="60"/>
-        <w:ind w:left="403" w:hanging="403"/>
+        <w:spacing w:after="40"/>
+        <w:ind w:left="259" w:hanging="259"/>
       </w:pPr>
       <w:r>
         <w:rPr>
           <w:b/>
-          <w:color w:val="7A171B"/>
         </w:rPr>
-        <w:t>1.</w:t>
+        <w:t xml:space="preserve">1. </w:t>
       </w:r>
       <w:r>
-        <w:t xml:space="preserve">  Open Safari and go to the hosted link.</w:t>
+        <w:t>Open Chrome and go to the website.</w:t>
       </w:r>
     </w:p>
     <w:p>
       <w:pPr>
-        <w:spacing w:after="60"/>
-        <w:ind w:left="403" w:hanging="403"/>
+        <w:spacing w:after="40"/>
+        <w:ind w:left="259" w:hanging="259"/>
       </w:pPr>
       <w:r>
         <w:rPr>
           <w:b/>
-          <w:color w:val="7A171B"/>
         </w:rPr>
-        <w:t>2.</w:t>
+        <w:t xml:space="preserve">2. </w:t>
       </w:r>
       <w:r>
-        <w:t xml:space="preserve">  Choose File &gt; Add to Dock. You can also select Share &gt; Add to Dock.</w:t>
+        <w:t>Tap the three-dot menu.</w:t>
       </w:r>
     </w:p>
     <w:p>
       <w:pPr>
-        <w:spacing w:after="60"/>
-        <w:ind w:left="403" w:hanging="403"/>
+        <w:spacing w:after="40"/>
+        <w:ind w:left="259" w:hanging="259"/>
       </w:pPr>
       <w:r>
         <w:rPr>
           <w:b/>
-          <w:color w:val="7A171B"/>
         </w:rPr>
-        <w:t>3.</w:t>
+        <w:t xml:space="preserve">3. </w:t>
       </w:r>
       <w:r>
-        <w:t xml:space="preserve">  Confirm the app name and select Add.</w:t>
+        <w:t>Tap Install app or Add to Home screen.</w:t>
       </w:r>
     </w:p>
     <w:p>
       <w:pPr>
-        <w:spacing w:after="60"/>
-        <w:ind w:left="403" w:hanging="403"/>
+        <w:spacing w:after="40"/>
+        <w:ind w:left="259" w:hanging="259"/>
       </w:pPr>
       <w:r>
         <w:rPr>
           <w:b/>
-          <w:color w:val="7A171B"/>
         </w:rPr>
-        <w:t>4.</w:t>
+        <w:t xml:space="preserve">4. </w:t>
       </w:r>
       <w:r>
-        <w:t xml:space="preserve">  Open the app from the Dock, Spotlight, or the Applications folder in your home folder.</w:t>
-      </w:r>
-    </w:p>
-    <w:p>
-      <w:pPr>
-        <w:spacing w:after="60"/>
-        <w:ind w:left="403" w:hanging="403"/>
-      </w:pPr>
-      <w:r>
-        <w:rPr>
-          <w:b/>
-          <w:color w:val="7A171B"/>
-        </w:rPr>
-        <w:t>5.</w:t>
-      </w:r>
-      <w:r>
-        <w:t xml:space="preserve">  Confirm Version 1.3.4.</w:t>
-      </w:r>
-    </w:p>
-    <w:tbl>
-      <w:tblPr>
-        <w:tblW w:type="auto" w:w="0"/>
-        <w:jc w:val="center"/>
-        <w:tblLook w:firstColumn="1" w:firstRow="1" w:lastColumn="0" w:lastRow="0" w:noHBand="0" w:noVBand="1" w:val="04A0"/>
-      </w:tblPr>
-      <w:tblGrid>
-        <w:gridCol w:w="10224"/>
-      </w:tblGrid>
-      <w:tr>
-        <w:tc>
-          <w:tcPr>
-            <w:tcW w:type="dxa" w:w="10224"/>
-            <w:shd w:fill="FAE8E7"/>
-            <w:tcMar>
-              <w:top w:w="120" w:type="dxa"/>
-              <w:start w:w="160" w:type="dxa"/>
-              <w:bottom w:w="120" w:type="dxa"/>
-              <w:end w:w="160" w:type="dxa"/>
-            </w:tcMar>
-            <w:tcBorders>
-              <w:top w:val="single" w:sz="10" w:color="A71F25"/>
-              <w:left w:val="single" w:sz="10" w:color="A71F25"/>
-              <w:bottom w:val="single" w:sz="10" w:color="A71F25"/>
-              <w:right w:val="single" w:sz="10" w:color="A71F25"/>
-            </w:tcBorders>
-          </w:tcPr>
-          <w:p>
-            <w:r>
-              <w:rPr>
-                <w:b/>
-                <w:color w:val="7A171B"/>
-              </w:rPr>
-              <w:t xml:space="preserve">Important local-data warning. </w:t>
-            </w:r>
-            <w:r>
-              <w:t>Safari web apps keep website data separate from the normal Safari browser. Install the app before entering real expenses. If data already exists in Safari, download a backup first and restore it inside the installed web app.</w:t>
-            </w:r>
-          </w:p>
-        </w:tc>
-      </w:tr>
-    </w:tbl>
-    <w:p>
-      <w:pPr>
-        <w:spacing w:after="0"/>
-      </w:pPr>
-    </w:p>
-    <w:p>
-      <w:pPr>
-        <w:pStyle w:val="Heading1"/>
-      </w:pPr>
-      <w:r>
-        <w:t>iPhone or iPad - Chrome alternative</w:t>
-      </w:r>
-    </w:p>
-    <w:p>
-      <w:r>
-        <w:t>Safari is the recommended Apple mobile installation path. Chrome also supports adding the site to the Home Screen:</w:t>
-      </w:r>
-    </w:p>
-    <w:p>
-      <w:pPr>
-        <w:spacing w:after="60"/>
-        <w:ind w:left="403" w:hanging="403"/>
-      </w:pPr>
-      <w:r>
-        <w:rPr>
-          <w:b/>
-          <w:color w:val="7A171B"/>
-        </w:rPr>
-        <w:t>1.</w:t>
-      </w:r>
-      <w:r>
-        <w:t xml:space="preserve">  Open Chrome and go to the hosted link.</w:t>
-      </w:r>
-    </w:p>
-    <w:p>
-      <w:pPr>
-        <w:spacing w:after="60"/>
-        <w:ind w:left="403" w:hanging="403"/>
-      </w:pPr>
-      <w:r>
-        <w:rPr>
-          <w:b/>
-          <w:color w:val="7A171B"/>
-        </w:rPr>
-        <w:t>2.</w:t>
-      </w:r>
-      <w:r>
-        <w:t xml:space="preserve">  Tap Share on the right side of the address bar.</w:t>
-      </w:r>
-    </w:p>
-    <w:p>
-      <w:pPr>
-        <w:spacing w:after="60"/>
-        <w:ind w:left="403" w:hanging="403"/>
-      </w:pPr>
-      <w:r>
-        <w:rPr>
-          <w:b/>
-          <w:color w:val="7A171B"/>
-        </w:rPr>
-        <w:t>3.</w:t>
-      </w:r>
-      <w:r>
-        <w:t xml:space="preserve">  Tap Add to Home Screen.</w:t>
-      </w:r>
-    </w:p>
-    <w:p>
-      <w:pPr>
-        <w:spacing w:after="60"/>
-        <w:ind w:left="403" w:hanging="403"/>
-      </w:pPr>
-      <w:r>
-        <w:rPr>
-          <w:b/>
-          <w:color w:val="7A171B"/>
-        </w:rPr>
-        <w:t>4.</w:t>
-      </w:r>
-      <w:r>
-        <w:t xml:space="preserve">  Confirm the name and tap Add.</w:t>
-      </w:r>
-    </w:p>
-    <w:p>
-      <w:r>
-        <w:rPr>
-          <w:i/>
-        </w:rPr>
-        <w:t>Because the resulting behavior can vary by website and iOS/iPadOS version, use Safari when possible for the controlled trial.</w:t>
+        <w:t>Follow the prompts.</w:t>
       </w:r>
     </w:p>
     <w:p>
@@ -1471,87 +510,39 @@
         <w:pStyle w:val="Heading1"/>
       </w:pPr>
       <w:r>
-        <w:t>After installation - five-minute check</w:t>
+        <w:t>Mobile reminders</w:t>
       </w:r>
     </w:p>
     <w:p>
       <w:pPr>
-        <w:spacing w:after="60"/>
-        <w:ind w:left="403" w:hanging="403"/>
+        <w:pStyle w:val="ListBullet"/>
+        <w:spacing w:after="40"/>
       </w:pPr>
       <w:r>
-        <w:rPr>
-          <w:b/>
-          <w:color w:val="7A171B"/>
-        </w:rPr>
-        <w:t>1.</w:t>
-      </w:r>
-      <w:r>
-        <w:t xml:space="preserve">  Open Settings and save the employee name, department, and default report recipient.</w:t>
+        <w:t>Open the installed icon instead of switching between different browsers.</w:t>
       </w:r>
     </w:p>
     <w:p>
       <w:pPr>
-        <w:spacing w:after="60"/>
-        <w:ind w:left="403" w:hanging="403"/>
+        <w:pStyle w:val="ListBullet"/>
+        <w:spacing w:after="40"/>
       </w:pPr>
       <w:r>
-        <w:rPr>
-          <w:b/>
-          <w:color w:val="7A171B"/>
-        </w:rPr>
-        <w:t>2.</w:t>
-      </w:r>
-      <w:r>
-        <w:t xml:space="preserve">  Add one test expense and, when applicable, one test receipt.</w:t>
+        <w:t>Use Share PDF or Share CSV when the phone can pass the file directly to Outlook or another app.</w:t>
       </w:r>
     </w:p>
     <w:p>
       <w:pPr>
-        <w:spacing w:after="60"/>
-        <w:ind w:left="403" w:hanging="403"/>
+        <w:pStyle w:val="ListBullet"/>
+        <w:spacing w:after="40"/>
       </w:pPr>
       <w:r>
-        <w:rPr>
-          <w:b/>
-          <w:color w:val="7A171B"/>
-        </w:rPr>
-        <w:t>3.</w:t>
-      </w:r>
-      <w:r>
-        <w:t xml:space="preserve">  Close and reopen the installed app to confirm the information remains.</w:t>
+        <w:t>Download a backup regularly and store it securely.</w:t>
       </w:r>
     </w:p>
     <w:p>
-      <w:pPr>
-        <w:spacing w:after="60"/>
-        <w:ind w:left="403" w:hanging="403"/>
-      </w:pPr>
       <w:r>
-        <w:rPr>
-          <w:b/>
-          <w:color w:val="7A171B"/>
-        </w:rPr>
-        <w:t>4.</w:t>
-      </w:r>
-      <w:r>
-        <w:t xml:space="preserve">  Download a backup and confirm the backup reminder clears.</w:t>
-      </w:r>
-    </w:p>
-    <w:p>
-      <w:pPr>
-        <w:spacing w:after="60"/>
-        <w:ind w:left="403" w:hanging="403"/>
-      </w:pPr>
-      <w:r>
-        <w:rPr>
-          <w:b/>
-          <w:color w:val="7A171B"/>
-        </w:rPr>
-        <w:t>5.</w:t>
-      </w:r>
-      <w:r>
-        <w:t xml:space="preserve">  Test PDF and CSV download or sharing before using the app for a real reporting period.</w:t>
+        <w:br w:type="page"/>
       </w:r>
     </w:p>
     <w:p>
@@ -1559,59 +550,67 @@
         <w:pStyle w:val="Heading1"/>
       </w:pPr>
       <w:r>
-        <w:t>Troubleshooting</w:t>
+        <w:t>Mac - Safari</w:t>
       </w:r>
     </w:p>
     <w:p>
       <w:pPr>
-        <w:pStyle w:val="Heading2"/>
+        <w:spacing w:after="40"/>
+        <w:ind w:left="259" w:hanging="259"/>
       </w:pPr>
       <w:r>
-        <w:t>The Install option does not appear</w:t>
+        <w:rPr>
+          <w:b/>
+        </w:rPr>
+        <w:t xml:space="preserve">1. </w:t>
       </w:r>
-    </w:p>
-    <w:p>
       <w:r>
-        <w:t>Confirm the app is opened from the hosted HTTPS address, not the standalone HTML file. Refresh the page, confirm the browser is current, and make sure private browsing is off. On a company-managed device, installation may be blocked by IT policy.</w:t>
+        <w:t>Open Safari and go to the website.</w:t>
       </w:r>
     </w:p>
     <w:p>
       <w:pPr>
-        <w:pStyle w:val="Heading2"/>
+        <w:spacing w:after="40"/>
+        <w:ind w:left="259" w:hanging="259"/>
       </w:pPr>
       <w:r>
-        <w:t>The installed app shows an old version</w:t>
+        <w:rPr>
+          <w:b/>
+        </w:rPr>
+        <w:t xml:space="preserve">2. </w:t>
       </w:r>
-    </w:p>
-    <w:p>
       <w:r>
-        <w:t>Close the installed app. Open the hosted link in the same browser and refresh it, then reopen the installed app. Make a backup before clearing site data or reinstalling.</w:t>
+        <w:t>Choose File, then Add to Dock.</w:t>
       </w:r>
     </w:p>
     <w:p>
       <w:pPr>
-        <w:pStyle w:val="Heading2"/>
+        <w:spacing w:after="40"/>
+        <w:ind w:left="259" w:hanging="259"/>
       </w:pPr>
       <w:r>
-        <w:t>Expenses are missing after installation</w:t>
+        <w:rPr>
+          <w:b/>
+        </w:rPr>
+        <w:t xml:space="preserve">3. </w:t>
       </w:r>
-    </w:p>
-    <w:p>
       <w:r>
-        <w:t>The app may be using a different browser, profile, device, or Safari web-app data container. Return to the original location, download a backup, then restore the backup in the installed app.</w:t>
+        <w:t>Confirm the name and select Add.</w:t>
       </w:r>
     </w:p>
     <w:p>
       <w:pPr>
-        <w:pStyle w:val="Heading2"/>
+        <w:spacing w:after="40"/>
+        <w:ind w:left="259" w:hanging="259"/>
       </w:pPr>
       <w:r>
-        <w:t>Before uninstalling</w:t>
+        <w:rPr>
+          <w:b/>
+        </w:rPr>
+        <w:t xml:space="preserve">4. </w:t>
       </w:r>
-    </w:p>
-    <w:p>
       <w:r>
-        <w:t>Download a backup first. Do not choose an option such as also delete data unless a confirmed backup exists and all local records should be removed.</w:t>
+        <w:t>Open the new app from the Dock or Applications.</w:t>
       </w:r>
     </w:p>
     <w:p>
@@ -1619,154 +618,146 @@
         <w:pStyle w:val="Heading1"/>
       </w:pPr>
       <w:r>
-        <w:t>Official reference sources</w:t>
+        <w:t>If Install is not available</w:t>
       </w:r>
     </w:p>
     <w:p>
       <w:pPr>
         <w:pStyle w:val="ListBullet"/>
+        <w:spacing w:after="40"/>
       </w:pPr>
-      <w:hyperlink r:id="rId11">
-        <w:r>
-          <w:rPr>
-            <w:color w:val="7A171B"/>
-            <w:u w:val="single"/>
-          </w:rPr>
-          <w:t>Google Chrome Help - Use web apps</w:t>
-        </w:r>
-      </w:hyperlink>
+      <w:r>
+        <w:t>Confirm you opened the website in the browser listed for your device.</w:t>
+      </w:r>
     </w:p>
     <w:p>
       <w:pPr>
         <w:pStyle w:val="ListBullet"/>
+        <w:spacing w:after="40"/>
       </w:pPr>
-      <w:hyperlink r:id="rId12">
-        <w:r>
-          <w:rPr>
-            <w:color w:val="7A171B"/>
-            <w:u w:val="single"/>
-          </w:rPr>
-          <w:t>Microsoft Support - Install, manage, or uninstall apps in Microsoft Edge</w:t>
-        </w:r>
-      </w:hyperlink>
+      <w:r>
+        <w:t>Refresh the page and check the browser menu again.</w:t>
+      </w:r>
     </w:p>
     <w:p>
       <w:pPr>
         <w:pStyle w:val="ListBullet"/>
+        <w:spacing w:after="40"/>
       </w:pPr>
-      <w:hyperlink r:id="rId13">
-        <w:r>
-          <w:rPr>
-            <w:color w:val="7A171B"/>
-            <w:u w:val="single"/>
-          </w:rPr>
-          <w:t>Apple Support - Turn a website into an app in Safari on iPhone</w:t>
-        </w:r>
-      </w:hyperlink>
+      <w:r>
+        <w:t>Company browser policies may block web app installation. Contact IT if the option is missing on a managed device.</w:t>
+      </w:r>
     </w:p>
     <w:p>
       <w:pPr>
         <w:pStyle w:val="ListBullet"/>
+        <w:spacing w:after="40"/>
       </w:pPr>
-      <w:hyperlink r:id="rId14">
-        <w:r>
-          <w:rPr>
-            <w:color w:val="7A171B"/>
-            <w:u w:val="single"/>
-          </w:rPr>
-          <w:t>Apple Support - Turn a website into an app in Safari on iPad</w:t>
-        </w:r>
-      </w:hyperlink>
+      <w:r>
+        <w:t>You can still bookmark the website and use it in the browser.</w:t>
+      </w:r>
     </w:p>
     <w:p>
       <w:pPr>
-        <w:pStyle w:val="ListBullet"/>
+        <w:pStyle w:val="Heading1"/>
       </w:pPr>
-      <w:hyperlink r:id="rId15">
-        <w:r>
-          <w:rPr>
-            <w:color w:val="7A171B"/>
-            <w:u w:val="single"/>
-          </w:rPr>
-          <w:t>Apple Support - Use Safari web apps on Mac</w:t>
-        </w:r>
-      </w:hyperlink>
-    </w:p>
-    <w:tbl>
-      <w:tblPr>
-        <w:tblW w:type="auto" w:w="0"/>
-        <w:jc w:val="center"/>
-        <w:tblLook w:firstColumn="1" w:firstRow="1" w:lastColumn="0" w:lastRow="0" w:noHBand="0" w:noVBand="1" w:val="04A0"/>
-      </w:tblPr>
-      <w:tblGrid>
-        <w:gridCol w:w="10224"/>
-      </w:tblGrid>
-      <w:tr>
-        <w:tc>
-          <w:tcPr>
-            <w:tcW w:type="dxa" w:w="10224"/>
-            <w:shd w:fill="EAF2E4"/>
-            <w:tcMar>
-              <w:top w:w="120" w:type="dxa"/>
-              <w:start w:w="160" w:type="dxa"/>
-              <w:bottom w:w="120" w:type="dxa"/>
-              <w:end w:w="160" w:type="dxa"/>
-            </w:tcMar>
-            <w:tcBorders>
-              <w:top w:val="single" w:sz="10" w:color="557044"/>
-              <w:left w:val="single" w:sz="10" w:color="557044"/>
-              <w:bottom w:val="single" w:sz="10" w:color="557044"/>
-              <w:right w:val="single" w:sz="10" w:color="557044"/>
-            </w:tcBorders>
-          </w:tcPr>
-          <w:p>
-            <w:r>
-              <w:rPr>
-                <w:b/>
-                <w:color w:val="7A171B"/>
-              </w:rPr>
-              <w:t xml:space="preserve">Trial reminder. </w:t>
-            </w:r>
-            <w:r>
-              <w:t>The installation improves access and offline reopening, but it does not convert the local-first application into a multi-user cloud system. Each employee must continue using one primary device/browser and creating backups.</w:t>
-            </w:r>
-          </w:p>
-        </w:tc>
-      </w:tr>
-    </w:tbl>
-    <w:p>
-      <w:pPr>
-        <w:spacing w:after="0"/>
-      </w:pPr>
+      <w:r>
+        <w:t>If an old version appears</w:t>
+      </w:r>
     </w:p>
     <w:p>
       <w:pPr>
-        <w:jc w:val="center"/>
+        <w:spacing w:after="40"/>
+        <w:ind w:left="259" w:hanging="259"/>
       </w:pPr>
       <w:r>
         <w:rPr>
           <w:b/>
-          <w:color w:val="7A171B"/>
         </w:rPr>
-        <w:t>Copyright © 2026 Saul Garcia. All Rights Reserved.</w:t>
+        <w:t xml:space="preserve">1. </w:t>
+      </w:r>
+      <w:r>
+        <w:t>Close the installed app.</w:t>
       </w:r>
     </w:p>
     <w:p>
       <w:pPr>
-        <w:jc w:val="center"/>
+        <w:spacing w:after="40"/>
+        <w:ind w:left="259" w:hanging="259"/>
       </w:pPr>
       <w:r>
         <w:rPr>
-          <w:i/>
+          <w:b/>
         </w:rPr>
-        <w:t>Licensed for Pizza Ranch internal business use and IT evaluation.</w:t>
+        <w:t xml:space="preserve">2. </w:t>
+      </w:r>
+      <w:r>
+        <w:t>Open the website in the original browser.</w:t>
+      </w:r>
+    </w:p>
+    <w:p>
+      <w:pPr>
+        <w:spacing w:after="40"/>
+        <w:ind w:left="259" w:hanging="259"/>
+      </w:pPr>
+      <w:r>
+        <w:rPr>
+          <w:b/>
+        </w:rPr>
+        <w:t xml:space="preserve">3. </w:t>
+      </w:r>
+      <w:r>
+        <w:t>Refresh the page. On Windows, Ctrl + Shift + R performs a hard refresh.</w:t>
+      </w:r>
+    </w:p>
+    <w:p>
+      <w:pPr>
+        <w:spacing w:after="40"/>
+        <w:ind w:left="259" w:hanging="259"/>
+      </w:pPr>
+      <w:r>
+        <w:rPr>
+          <w:b/>
+        </w:rPr>
+        <w:t xml:space="preserve">4. </w:t>
+      </w:r>
+      <w:r>
+        <w:t>Confirm the footer shows Version 1.4.0, then reopen the installed app.</w:t>
+      </w:r>
+    </w:p>
+    <w:p>
+      <w:pPr>
+        <w:pStyle w:val="Heading1"/>
+      </w:pPr>
+      <w:r>
+        <w:t>Before removing the app</w:t>
+      </w:r>
+    </w:p>
+    <w:p>
+      <w:pPr>
+        <w:spacing w:after="120"/>
+      </w:pPr>
+      <w:r>
+        <w:t>Download a current backup first. During removal, a browser may offer to delete the app's browsing data. Deleting site data can remove locally stored expenses, reports, and receipts.</w:t>
+      </w:r>
+    </w:p>
+    <w:p>
+      <w:pPr>
+        <w:pStyle w:val="Heading1"/>
+      </w:pPr>
+      <w:r>
+        <w:t>Need help?</w:t>
+      </w:r>
+    </w:p>
+    <w:p>
+      <w:r>
+        <w:t>Take a screenshot of the device, browser, and step where the issue occurs. Include the version shown in the app footer.</w:t>
       </w:r>
     </w:p>
     <w:sectPr>
-      <w:headerReference w:type="default" r:id="rId9"/>
-      <w:footerReference w:type="default" r:id="rId10"/>
+      <w:footerReference w:type="default" r:id="rId9"/>
       <w:pgSz w:w="12240" w:h="15840"/>
-      <w:pgMar w:top="792" w:right="1008" w:bottom="792" w:left="1008" w:header="720" w:footer="720" w:gutter="0"/>
+      <w:pgMar w:top="893" w:right="1037" w:bottom="893" w:left="1037" w:header="720" w:footer="720" w:gutter="0"/>
       <w:cols w:space="720"/>
       <w:docGrid w:linePitch="360"/>
     </w:sectPr>
@@ -1783,34 +774,13 @@
     </w:pPr>
     <w:r>
       <w:rPr>
-        <w:rFonts w:ascii="Aptos" w:hAnsi="Aptos"/>
-        <w:color w:val="766A60"/>
+        <w:color w:val="6E645C"/>
         <w:sz w:val="16"/>
       </w:rPr>
-      <w:t>Version 1.3.4  |  Pizza Ranch internal business use and IT evaluation  |  July 29, 2026</w:t>
+      <w:t>Ranch Expense Tracker | Web App Installation Guide | Version 1.4.0</w:t>
     </w:r>
   </w:p>
 </w:ftr>
-</file>
-
-<file path=word/header1.xml><?xml version="1.0" encoding="utf-8"?>
-<w:hdr xmlns:m="http://schemas.openxmlformats.org/officeDocument/2006/math" xmlns:mc="http://schemas.openxmlformats.org/markup-compatibility/2006" xmlns:mo="http://schemas.microsoft.com/office/mac/office/2008/main" xmlns:mv="urn:schemas-microsoft-com:mac:vml" xmlns:o="urn:schemas-microsoft-com:office:office" xmlns:r="http://schemas.openxmlformats.org/officeDocument/2006/relationships" xmlns:v="urn:schemas-microsoft-com:vml" xmlns:w10="urn:schemas-microsoft-com:office:word" xmlns:w14="http://schemas.microsoft.com/office/word/2010/wordml" xmlns:w="http://schemas.openxmlformats.org/wordprocessingml/2006/main" xmlns:wne="http://schemas.microsoft.com/office/word/2006/wordml" xmlns:wp14="http://schemas.microsoft.com/office/word/2010/wordprocessingDrawing" xmlns:wp="http://schemas.openxmlformats.org/drawingml/2006/wordprocessingDrawing" xmlns:wpc="http://schemas.microsoft.com/office/word/2010/wordprocessingCanvas" xmlns:wpg="http://schemas.microsoft.com/office/word/2010/wordprocessingGroup" xmlns:wpi="http://schemas.microsoft.com/office/word/2010/wordprocessingInk" xmlns:wps="http://schemas.microsoft.com/office/word/2010/wordprocessingShape" mc:Ignorable="w14 wp14">
-  <w:p>
-    <w:pPr>
-      <w:pStyle w:val="Header"/>
-      <w:jc w:val="right"/>
-    </w:pPr>
-    <w:r>
-      <w:rPr>
-        <w:rFonts w:ascii="Aptos" w:hAnsi="Aptos"/>
-        <w:b/>
-        <w:color w:val="7A171B"/>
-        <w:sz w:val="16"/>
-      </w:rPr>
-      <w:t>RANCH EXPENSE TRACKER  |  WEB APP INSTALLATION GUIDE</w:t>
-    </w:r>
-  </w:p>
-</w:hdr>
 </file>
 
 <file path=word/numbering.xml><?xml version="1.0" encoding="utf-8"?>
@@ -2176,13 +1146,9 @@
     <w:name w:val="Normal"/>
     <w:qFormat/>
     <w:rsid w:val="00FC693F"/>
-    <w:pPr>
-      <w:spacing w:after="100"/>
-    </w:pPr>
     <w:rPr>
       <w:rFonts w:ascii="Aptos" w:hAnsi="Aptos"/>
-      <w:color w:val="2A231E"/>
-      <w:sz w:val="20"/>
+      <w:sz w:val="21"/>
     </w:rPr>
   </w:style>
   <w:style w:type="paragraph" w:styleId="Header">
@@ -2240,14 +1206,14 @@
     <w:pPr>
       <w:keepNext/>
       <w:keepLines/>
-      <w:spacing w:before="160" w:after="80"/>
+      <w:spacing w:before="120" w:after="120"/>
       <w:outlineLvl w:val="0"/>
     </w:pPr>
     <w:rPr>
       <w:rFonts w:asciiTheme="majorHAnsi" w:eastAsiaTheme="majorEastAsia" w:hAnsiTheme="majorHAnsi" w:cstheme="majorBidi" w:ascii="Aptos Display" w:hAnsi="Aptos Display"/>
       <w:b/>
       <w:bCs/>
-      <w:color w:val="721419"/>
+      <w:color w:val="7A171B"/>
       <w:sz w:val="34"/>
       <w:szCs w:val="28"/>
     </w:rPr>
@@ -2264,14 +1230,14 @@
     <w:pPr>
       <w:keepNext/>
       <w:keepLines/>
-      <w:spacing w:before="160" w:after="80"/>
+      <w:spacing w:before="140" w:after="60"/>
       <w:outlineLvl w:val="1"/>
     </w:pPr>
     <w:rPr>
       <w:rFonts w:asciiTheme="majorHAnsi" w:eastAsiaTheme="majorEastAsia" w:hAnsiTheme="majorHAnsi" w:cstheme="majorBidi" w:ascii="Aptos Display" w:hAnsi="Aptos Display"/>
       <w:b/>
       <w:bCs/>
-      <w:color w:val="A71F25"/>
+      <w:color w:val="2A231E"/>
       <w:sz w:val="26"/>
       <w:szCs w:val="26"/>
     </w:rPr>
@@ -2288,15 +1254,14 @@
     <w:pPr>
       <w:keepNext/>
       <w:keepLines/>
-      <w:spacing w:before="160" w:after="80"/>
+      <w:spacing w:before="200" w:after="0"/>
       <w:outlineLvl w:val="2"/>
     </w:pPr>
     <w:rPr>
-      <w:rFonts w:asciiTheme="majorHAnsi" w:eastAsiaTheme="majorEastAsia" w:hAnsiTheme="majorHAnsi" w:cstheme="majorBidi" w:ascii="Aptos Display" w:hAnsi="Aptos Display"/>
+      <w:rFonts w:asciiTheme="majorHAnsi" w:eastAsiaTheme="majorEastAsia" w:hAnsiTheme="majorHAnsi" w:cstheme="majorBidi"/>
       <w:b/>
       <w:bCs/>
-      <w:color w:val="557044"/>
-      <w:sz w:val="22"/>
+      <w:color w:val="4F81BD" w:themeColor="accent1"/>
     </w:rPr>
   </w:style>
   <w:style w:type="paragraph" w:styleId="Heading4">
@@ -2530,13 +1495,13 @@
       <w:pBdr>
         <w:bottom w:val="single" w:sz="8" w:space="4" w:color="4F81BD" w:themeColor="accent1"/>
       </w:pBdr>
-      <w:spacing w:after="80" w:line="240" w:lineRule="auto" w:before="160"/>
+      <w:spacing w:after="300" w:line="240" w:lineRule="auto"/>
       <w:contextualSpacing/>
     </w:pPr>
     <w:rPr>
       <w:rFonts w:asciiTheme="majorHAnsi" w:eastAsiaTheme="majorEastAsia" w:hAnsiTheme="majorHAnsi" w:cstheme="majorBidi" w:ascii="Aptos Display" w:hAnsi="Aptos Display"/>
       <w:b/>
-      <w:color w:val="721419"/>
+      <w:color w:val="481816"/>
       <w:spacing w:val="5"/>
       <w:kern w:val="28"/>
       <w:sz w:val="50"/>
@@ -2713,13 +1678,8 @@
       <w:numPr>
         <w:numId w:val="1"/>
       </w:numPr>
-      <w:spacing w:after="60"/>
       <w:contextualSpacing/>
     </w:pPr>
-    <w:rPr>
-      <w:rFonts w:ascii="Aptos" w:hAnsi="Aptos"/>
-      <w:sz w:val="20"/>
-    </w:rPr>
   </w:style>
   <w:style w:type="paragraph" w:styleId="ListBullet2">
     <w:name w:val="List Bullet 2"/>
@@ -2757,13 +1717,8 @@
       <w:numPr>
         <w:numId w:val="5"/>
       </w:numPr>
-      <w:spacing w:after="60"/>
       <w:contextualSpacing/>
     </w:pPr>
-    <w:rPr>
-      <w:rFonts w:ascii="Aptos" w:hAnsi="Aptos"/>
-      <w:sz w:val="20"/>
-    </w:rPr>
   </w:style>
   <w:style w:type="paragraph" w:styleId="ListNumber2">
     <w:name w:val="List Number 2"/>

</xml_diff>